<commit_message>
Update synopsis: PhishScope research topic with student details (Utkarsh Karale, PRN 25PCS1018, Roll No 118, Guide Prof Vikas Patil)
</commit_message>
<xml_diff>
--- a/MTech_Research_Synopsis_Adaptive_XAI_Trustworthy_ML-V1.docx
+++ b/MTech_Research_Synopsis_Adaptive_XAI_Trustworthy_ML-V1.docx
@@ -1,6 +1,6 @@
 
 <file path=word/document.xml><?xml version="1.0" encoding="utf-8"?>
-<w:document xmlns:wpc="http://schemas.microsoft.com/office/word/2010/wordprocessingCanvas" xmlns:mc="http://schemas.openxmlformats.org/markup-compatibility/2006" xmlns:o="urn:schemas-microsoft-com:office:office" xmlns:r="http://schemas.openxmlformats.org/officeDocument/2006/relationships" xmlns:m="http://schemas.openxmlformats.org/officeDocument/2006/math" xmlns:v="urn:schemas-microsoft-com:vml" xmlns:wp14="http://schemas.microsoft.com/office/word/2010/wordprocessingDrawing" xmlns:wp="http://schemas.openxmlformats.org/drawingml/2006/wordprocessingDrawing" xmlns:w10="urn:schemas-microsoft-com:office:word" xmlns:w="http://schemas.openxmlformats.org/wordprocessingml/2006/main" xmlns:w14="http://schemas.microsoft.com/office/word/2010/wordml" xmlns:wpg="http://schemas.microsoft.com/office/word/2010/wordprocessingGroup" xmlns:wpi="http://schemas.microsoft.com/office/word/2010/wordprocessingInk" xmlns:wne="http://schemas.microsoft.com/office/word/2006/wordml" xmlns:wps="http://schemas.microsoft.com/office/word/2010/wordprocessingShape" mc:Ignorable="w14 wp14">
+<w:document xmlns:a="http://schemas.openxmlformats.org/drawingml/2006/main" xmlns:mc="http://schemas.openxmlformats.org/markup-compatibility/2006" xmlns:ns4="http://schemas.openxmlformats.org/drawingml/2006/picture" xmlns:ns6="http://schemas.microsoft.com/office/drawing/2010/main" xmlns:o="urn:schemas-microsoft-com:office:office" xmlns:r="http://schemas.openxmlformats.org/officeDocument/2006/relationships" xmlns:v="urn:schemas-microsoft-com:vml" xmlns:w="http://schemas.openxmlformats.org/wordprocessingml/2006/main" xmlns:w10="urn:schemas-microsoft-com:office:word" xmlns:wp="http://schemas.openxmlformats.org/drawingml/2006/wordprocessingDrawing" xmlns:wp14="http://schemas.microsoft.com/office/word/2010/wordprocessingDrawing" xmlns:wps="http://schemas.microsoft.com/office/word/2010/wordprocessingShape" mc:Ignorable="w14 wp14">
   <w:body>
     <w:tbl>
       <w:tblPr>
@@ -53,22 +53,22 @@
                   <wp:effectExtent l="0" t="0" r="9525" b="0"/>
                   <wp:docPr id="18" name="Picture 18"/>
                   <wp:cNvGraphicFramePr>
-                    <a:graphicFrameLocks xmlns:a="http://schemas.openxmlformats.org/drawingml/2006/main" noChangeAspect="1"/>
+                    <a:graphicFrameLocks noChangeAspect="1"/>
                   </wp:cNvGraphicFramePr>
-                  <a:graphic xmlns:a="http://schemas.openxmlformats.org/drawingml/2006/main">
+                  <a:graphic>
                     <a:graphicData uri="http://schemas.openxmlformats.org/drawingml/2006/picture">
-                      <pic:pic xmlns:pic="http://schemas.openxmlformats.org/drawingml/2006/picture">
-                        <pic:nvPicPr>
-                          <pic:cNvPr id="0" name="Picture 9"/>
-                          <pic:cNvPicPr>
+                      <ns4:pic>
+                        <ns4:nvPicPr>
+                          <ns4:cNvPr id="0" name="Picture 9"/>
+                          <ns4:cNvPicPr>
                             <a:picLocks noChangeAspect="1" noChangeArrowheads="1"/>
-                          </pic:cNvPicPr>
-                        </pic:nvPicPr>
-                        <pic:blipFill>
+                          </ns4:cNvPicPr>
+                        </ns4:nvPicPr>
+                        <ns4:blipFill>
                           <a:blip r:embed="rId9">
                             <a:extLst>
                               <a:ext uri="{28A0092B-C50C-407E-A947-70E740481C1C}">
-                                <a14:useLocalDpi xmlns:a14="http://schemas.microsoft.com/office/drawing/2010/main" val="0"/>
+                                <ns6:useLocalDpi val="0"/>
                               </a:ext>
                             </a:extLst>
                           </a:blip>
@@ -76,8 +76,8 @@
                           <a:stretch>
                             <a:fillRect/>
                           </a:stretch>
-                        </pic:blipFill>
-                        <pic:spPr bwMode="auto">
+                        </ns4:blipFill>
+                        <ns4:spPr bwMode="auto">
                           <a:xfrm>
                             <a:off x="0" y="0"/>
                             <a:ext cx="866775" cy="819150"/>
@@ -89,8 +89,8 @@
                           <a:ln>
                             <a:noFill/>
                           </a:ln>
-                        </pic:spPr>
-                      </pic:pic>
+                        </ns4:spPr>
+                      </ns4:pic>
                     </a:graphicData>
                   </a:graphic>
                 </wp:inline>
@@ -214,22 +214,22 @@
                   <wp:effectExtent l="0" t="0" r="0" b="0"/>
                   <wp:docPr id="17" name="Picture 17" descr="C:\Users\AMGOI\Desktop\images.jpeg"/>
                   <wp:cNvGraphicFramePr>
-                    <a:graphicFrameLocks xmlns:a="http://schemas.openxmlformats.org/drawingml/2006/main" noChangeAspect="1"/>
+                    <a:graphicFrameLocks noChangeAspect="1"/>
                   </wp:cNvGraphicFramePr>
-                  <a:graphic xmlns:a="http://schemas.openxmlformats.org/drawingml/2006/main">
+                  <a:graphic>
                     <a:graphicData uri="http://schemas.openxmlformats.org/drawingml/2006/picture">
-                      <pic:pic xmlns:pic="http://schemas.openxmlformats.org/drawingml/2006/picture">
-                        <pic:nvPicPr>
-                          <pic:cNvPr id="0" name="Picture 10" descr="C:\Users\AMGOI\Desktop\images.jpeg"/>
-                          <pic:cNvPicPr>
+                      <ns4:pic>
+                        <ns4:nvPicPr>
+                          <ns4:cNvPr id="0" name="Picture 10" descr="C:\Users\AMGOI\Desktop\images.jpeg"/>
+                          <ns4:cNvPicPr>
                             <a:picLocks noChangeAspect="1" noChangeArrowheads="1"/>
-                          </pic:cNvPicPr>
-                        </pic:nvPicPr>
-                        <pic:blipFill>
+                          </ns4:cNvPicPr>
+                        </ns4:nvPicPr>
+                        <ns4:blipFill>
                           <a:blip r:embed="rId10">
                             <a:extLst>
                               <a:ext uri="{28A0092B-C50C-407E-A947-70E740481C1C}">
-                                <a14:useLocalDpi xmlns:a14="http://schemas.microsoft.com/office/drawing/2010/main" val="0"/>
+                                <ns6:useLocalDpi val="0"/>
                               </a:ext>
                             </a:extLst>
                           </a:blip>
@@ -237,8 +237,8 @@
                           <a:stretch>
                             <a:fillRect/>
                           </a:stretch>
-                        </pic:blipFill>
-                        <pic:spPr bwMode="auto">
+                        </ns4:blipFill>
+                        <ns4:spPr bwMode="auto">
                           <a:xfrm>
                             <a:off x="0" y="0"/>
                             <a:ext cx="990600" cy="514350"/>
@@ -250,8 +250,8 @@
                           <a:ln>
                             <a:noFill/>
                           </a:ln>
-                        </pic:spPr>
-                      </pic:pic>
+                        </ns4:spPr>
+                      </ns4:pic>
                     </a:graphicData>
                   </a:graphic>
                 </wp:inline>
@@ -279,22 +279,22 @@
                   <wp:wrapNone/>
                   <wp:docPr id="21" name="Picture 21"/>
                   <wp:cNvGraphicFramePr>
-                    <a:graphicFrameLocks xmlns:a="http://schemas.openxmlformats.org/drawingml/2006/main" noChangeAspect="1"/>
+                    <a:graphicFrameLocks noChangeAspect="1"/>
                   </wp:cNvGraphicFramePr>
-                  <a:graphic xmlns:a="http://schemas.openxmlformats.org/drawingml/2006/main">
+                  <a:graphic>
                     <a:graphicData uri="http://schemas.openxmlformats.org/drawingml/2006/picture">
-                      <pic:pic xmlns:pic="http://schemas.openxmlformats.org/drawingml/2006/picture">
-                        <pic:nvPicPr>
-                          <pic:cNvPr id="0" name="Picture 11"/>
-                          <pic:cNvPicPr>
+                      <ns4:pic>
+                        <ns4:nvPicPr>
+                          <ns4:cNvPr id="0" name="Picture 11"/>
+                          <ns4:cNvPicPr>
                             <a:picLocks noChangeAspect="1" noChangeArrowheads="1"/>
-                          </pic:cNvPicPr>
-                        </pic:nvPicPr>
-                        <pic:blipFill>
+                          </ns4:cNvPicPr>
+                        </ns4:nvPicPr>
+                        <ns4:blipFill>
                           <a:blip r:embed="rId11">
                             <a:extLst>
                               <a:ext uri="{28A0092B-C50C-407E-A947-70E740481C1C}">
-                                <a14:useLocalDpi xmlns:a14="http://schemas.microsoft.com/office/drawing/2010/main" val="0"/>
+                                <ns6:useLocalDpi val="0"/>
                               </a:ext>
                             </a:extLst>
                           </a:blip>
@@ -302,8 +302,8 @@
                           <a:stretch>
                             <a:fillRect/>
                           </a:stretch>
-                        </pic:blipFill>
-                        <pic:spPr bwMode="auto">
+                        </ns4:blipFill>
+                        <ns4:spPr bwMode="auto">
                           <a:xfrm>
                             <a:off x="0" y="0"/>
                             <a:ext cx="914400" cy="840105"/>
@@ -315,8 +315,8 @@
                           <a:ln>
                             <a:noFill/>
                           </a:ln>
-                        </pic:spPr>
-                      </pic:pic>
+                        </ns4:spPr>
+                      </ns4:pic>
                     </a:graphicData>
                   </a:graphic>
                   <wp14:sizeRelH relativeFrom="page">
@@ -350,22 +350,22 @@
                   <wp:wrapNone/>
                   <wp:docPr id="20" name="Picture 20"/>
                   <wp:cNvGraphicFramePr>
-                    <a:graphicFrameLocks xmlns:a="http://schemas.openxmlformats.org/drawingml/2006/main" noChangeAspect="1"/>
+                    <a:graphicFrameLocks noChangeAspect="1"/>
                   </wp:cNvGraphicFramePr>
-                  <a:graphic xmlns:a="http://schemas.openxmlformats.org/drawingml/2006/main">
+                  <a:graphic>
                     <a:graphicData uri="http://schemas.openxmlformats.org/drawingml/2006/picture">
-                      <pic:pic xmlns:pic="http://schemas.openxmlformats.org/drawingml/2006/picture">
-                        <pic:nvPicPr>
-                          <pic:cNvPr id="0" name="Picture 12"/>
-                          <pic:cNvPicPr>
+                      <ns4:pic>
+                        <ns4:nvPicPr>
+                          <ns4:cNvPr id="0" name="Picture 12"/>
+                          <ns4:cNvPicPr>
                             <a:picLocks noChangeAspect="1" noChangeArrowheads="1"/>
-                          </pic:cNvPicPr>
-                        </pic:nvPicPr>
-                        <pic:blipFill>
+                          </ns4:cNvPicPr>
+                        </ns4:nvPicPr>
+                        <ns4:blipFill>
                           <a:blip r:embed="rId11">
                             <a:extLst>
                               <a:ext uri="{28A0092B-C50C-407E-A947-70E740481C1C}">
-                                <a14:useLocalDpi xmlns:a14="http://schemas.microsoft.com/office/drawing/2010/main" val="0"/>
+                                <ns6:useLocalDpi val="0"/>
                               </a:ext>
                             </a:extLst>
                           </a:blip>
@@ -373,8 +373,8 @@
                           <a:stretch>
                             <a:fillRect/>
                           </a:stretch>
-                        </pic:blipFill>
-                        <pic:spPr bwMode="auto">
+                        </ns4:blipFill>
+                        <ns4:spPr bwMode="auto">
                           <a:xfrm>
                             <a:off x="0" y="0"/>
                             <a:ext cx="914400" cy="840105"/>
@@ -386,8 +386,8 @@
                           <a:ln>
                             <a:noFill/>
                           </a:ln>
-                        </pic:spPr>
-                      </pic:pic>
+                        </ns4:spPr>
+                      </ns4:pic>
                     </a:graphicData>
                   </a:graphic>
                   <wp14:sizeRelH relativeFrom="page">
@@ -466,9 +466,9 @@
                       <wp:effectExtent l="9525" t="8255" r="8255" b="6350"/>
                       <wp:docPr id="19" name="Rounded Rectangle 19"/>
                       <wp:cNvGraphicFramePr>
-                        <a:graphicFrameLocks xmlns:a="http://schemas.openxmlformats.org/drawingml/2006/main"/>
+                        <a:graphicFrameLocks/>
                       </wp:cNvGraphicFramePr>
-                      <a:graphic xmlns:a="http://schemas.openxmlformats.org/drawingml/2006/main">
+                      <a:graphic>
                         <a:graphicData uri="http://schemas.microsoft.com/office/word/2010/wordprocessingShape">
                           <wps:wsp>
                             <wps:cNvSpPr>
@@ -892,14 +892,7 @@
                 <w:sz w:val="24"/>
                 <w:szCs w:val="24"/>
               </w:rPr>
-              <w:t>MR. RAJ  R. MANIKIRE (PRN No.-25PCS1007</w:t>
-            </w:r>
-            <w:r>
-              <w:rPr>
-                <w:sz w:val="24"/>
-                <w:szCs w:val="24"/>
-              </w:rPr>
-              <w:t>)</w:t>
+              <w:t xml:space="preserve">MR. UTKARSH KHANDU KARALE (PRN No.-25PCS1018)</w:t>
             </w:r>
           </w:p>
         </w:tc>
@@ -929,7 +922,7 @@
                 <w:sz w:val="24"/>
                 <w:szCs w:val="24"/>
               </w:rPr>
-              <w:t>Exam Seat No.</w:t>
+              <w:t xml:space="preserve">Roll No.</w:t>
             </w:r>
           </w:p>
         </w:tc>
@@ -951,7 +944,7 @@
                 <w:sz w:val="24"/>
                 <w:szCs w:val="24"/>
               </w:rPr>
-              <w:t>Exam Seat No.-1007</w:t>
+              <w:t xml:space="preserve">Roll No.-118</w:t>
             </w:r>
           </w:p>
         </w:tc>
@@ -1054,7 +1047,7 @@
                 <w:sz w:val="24"/>
                 <w:szCs w:val="24"/>
               </w:rPr>
-              <w:t>MR. A. B. DESAI</w:t>
+              <w:t xml:space="preserve">ASST. PROF. VIKAS PATIL</w:t>
             </w:r>
           </w:p>
         </w:tc>
@@ -1165,7 +1158,7 @@
                 <w:sz w:val="24"/>
                 <w:szCs w:val="24"/>
               </w:rPr>
-              <w:t>An Adaptive Explainable and Trustworthy Machine Learning Framework for Reliable Classification Using Uncertainty Estimation</w:t>
+              <w:t xml:space="preserve">PhishScope: An Explainable Hybrid Intelligence Framework for Static and Dynamic Phishing Website Analysis</w:t>
             </w:r>
           </w:p>
         </w:tc>
@@ -1213,7 +1206,7 @@
           <w:sz w:val="24"/>
           <w:szCs w:val="24"/>
         </w:rPr>
-        <w:t>Machine Learning (ML) has become an important technology for classification, prediction and decision-support applications. Modern ML models can achieve high predictive performance; however, many complex models operate as black boxes, making it difficult to understand why a particular prediction has been generated. This lack of transparency can reduce confidence in ML-based decisions, especially when a model is uncertain or produces an incorrect prediction.</w:t>
+        <w:t xml:space="preserve">Phishing websites have evolved into sophisticated cyberattacks that employ dynamic web content, JavaScript execution, multi-stage redirections, cloaking techniques, and rapidly changing infrastructure to evade conventional detection mechanisms. While recent machine learning and deep learning approaches have significantly improved detection accuracy, most existing solutions rely primarily on static website features such as URLs, HTML structure, domain information, and SSL certificate metadata. This research introduces PhishScope, an explainable hybrid intelligence framework that combines multi-source static feature analysis with isolated browser-based dynamic execution to generate transparent, evidence-based risk assessments.</w:t>
       </w:r>
     </w:p>
     <w:p>
@@ -1230,7 +1223,7 @@
           <w:sz w:val="24"/>
           <w:szCs w:val="24"/>
         </w:rPr>
-        <w:t>Explainable Artificial Intelligence (XAI) aims to address this limitation by providing understandable information about model behaviour and individual predictions. Model-agnostic methods such as SHAP (SHapley Additive exPlanations) and LIME (Local Interpretable Model-agnostic Explanations) can identify the contribution of input features to a prediction. Recent research also emphasizes that an explanation should be evaluated for properties such as faithfulness and stability rather than merely displayed to the user. [1], [2]</w:t>
+        <w:t xml:space="preserve"/>
       </w:r>
     </w:p>
     <w:p>
@@ -1247,7 +1240,7 @@
           <w:sz w:val="24"/>
           <w:szCs w:val="24"/>
         </w:rPr>
-        <w:t>Another important aspect of trustworthy ML is uncertainty estimation. A classification system should ideally provide not only a predicted class but also an indication of how certain or uncertain the prediction is. Recent studies have investigated uncertainty attribution and the integration of uncertainty with explainability to improve the assessment of ML decisions. [3], [4]</w:t>
+        <w:t xml:space="preserve"/>
       </w:r>
     </w:p>
     <w:p>
@@ -1264,7 +1257,7 @@
           <w:sz w:val="24"/>
           <w:szCs w:val="24"/>
         </w:rPr>
-        <w:t>Trustworthiness further requires that the confidence placed in a model is consistent with its actual reliability. Recent work on trustworthy AI has investigated trust calibration and has shown that explainability can support appropriate trust when the underlying model is reliable. [5], [6]</w:t>
+        <w:t xml:space="preserve"/>
       </w:r>
     </w:p>
     <w:p>
@@ -1281,7 +1274,7 @@
           <w:sz w:val="24"/>
           <w:szCs w:val="24"/>
         </w:rPr>
-        <w:t>Based on these developments, the proposed research will investigate an adaptive framework that jointly considers ML prediction, uncertainty estimation, explanation quality and model reliability to provide a quantitative assessment of the reliability of individual classification decisions.</w:t>
+        <w:t xml:space="preserve"/>
       </w:r>
     </w:p>
     <w:p>
@@ -1318,7 +1311,7 @@
           <w:sz w:val="24"/>
           <w:szCs w:val="24"/>
         </w:rPr>
-        <w:t>• High-performing ML models may be difficult to interpret and audit.</w:t>
+        <w:t xml:space="preserve">• Static-only analysis often fails to capture malicious runtime behaviors revealed during website execution.</w:t>
       </w:r>
     </w:p>
     <w:p>
@@ -1336,7 +1329,7 @@
           <w:sz w:val="24"/>
           <w:szCs w:val="24"/>
         </w:rPr>
-        <w:t>• A generated explanation does not automatically prove that a prediction is reliable.</w:t>
+        <w:t xml:space="preserve">• Many current machine learning detection systems operate as black-box models, providing limited interpretability.</w:t>
       </w:r>
     </w:p>
     <w:p>
@@ -1354,7 +1347,7 @@
           <w:sz w:val="24"/>
           <w:szCs w:val="24"/>
         </w:rPr>
-        <w:t>• Prediction confidence may not always correspond to actual predictive reliability.</w:t>
+        <w:t xml:space="preserve">• This lack of transparency restricts practical adoption in real-world cybersecurity environments.</w:t>
       </w:r>
     </w:p>
     <w:p>
@@ -1372,7 +1365,7 @@
           <w:sz w:val="24"/>
           <w:szCs w:val="24"/>
         </w:rPr>
-        <w:t>• Different XAI techniques can produce explanations with different levels of faithfulness and stability.</w:t>
+        <w:t xml:space="preserve">• Modern phishing attacks employ dynamic content, JavaScript obfuscation, and multi-stage redirections that static scanners miss entirely.</w:t>
       </w:r>
     </w:p>
     <w:p>
@@ -1390,7 +1383,7 @@
           <w:sz w:val="24"/>
           <w:szCs w:val="24"/>
         </w:rPr>
-        <w:t>• Quantitative evaluation of explanations can provide stronger evidence than visualization alone.</w:t>
+        <w:t xml:space="preserve">• Developing an integrated framework that applies Explainable Artificial Intelligence (XAI) to both static and dynamic telemetry will improve detection reliability.</w:t>
       </w:r>
     </w:p>
     <w:p>
@@ -1408,7 +1401,7 @@
           <w:sz w:val="24"/>
           <w:szCs w:val="24"/>
         </w:rPr>
-        <w:t>• Uncertainty information can help identify predictions that require caution or further analysis.</w:t>
+        <w:t xml:space="preserve">• An explainable phishing detection system will foster user trust and empower cybersecurity analysts with deployable investigation tools.</w:t>
       </w:r>
     </w:p>
     <w:p>
@@ -1426,7 +1419,7 @@
           <w:sz w:val="24"/>
           <w:szCs w:val="24"/>
         </w:rPr>
-        <w:t>• A joint assessment of uncertainty, explanation quality and model reliability may provide a more informative reliability signal for classification decisions.</w:t>
+        <w:t xml:space="preserve">• A practical deployment via browser extension and desktop application can bridge the gap between academic research and real-world cybersecurity needs.</w:t>
       </w:r>
     </w:p>
     <w:p>
@@ -1444,7 +1437,7 @@
           <w:sz w:val="24"/>
           <w:szCs w:val="24"/>
         </w:rPr>
-        <w:t xml:space="preserve">• A general-purpose evaluation framework can reduce dependence on a single application domain </w:t>
+        <w:t xml:space="preserve"/>
       </w:r>
     </w:p>
     <w:p>
@@ -1463,16 +1456,9 @@
           <w:sz w:val="24"/>
           <w:szCs w:val="24"/>
         </w:rPr>
-        <w:t>and</w:t>
+        <w:t xml:space="preserve"/>
       </w:r>
       <w:proofErr w:type="gramEnd"/>
-      <w:r>
-        <w:rPr>
-          <w:sz w:val="24"/>
-          <w:szCs w:val="24"/>
-        </w:rPr>
-        <w:t xml:space="preserve"> support comparison across multiple datasets and ML models.</w:t>
-      </w:r>
     </w:p>
     <w:p>
       <w:pPr>
@@ -3107,7 +3093,7 @@
           <w:sz w:val="24"/>
           <w:szCs w:val="24"/>
         </w:rPr>
-        <w:t>The literature indicates that explainability, uncertainty estimation, explanation evaluation and trustworthy AI are active and rapidly developing research areas. Recent studies have already explored several combinations of these components. Therefore, the proposed research does not claim novelty merely from combining XAI and uncertainty.</w:t>
+        <w:t xml:space="preserve">The review of current literature highlights a strong dependency on static URL and HTML features for phishing detection. Most contemporary studies focus on maximizing classification accuracy using models like Random Forest, CNNs, or BERT, but heavily neglect dynamic runtime behaviors (such as JavaScript execution or redirect chains). Additionally, while a few recent papers integrate XAI (like SHAP), they typically do so over limited feature sets rather than a comprehensive, multi-source framework.</w:t>
       </w:r>
     </w:p>
     <w:p>
@@ -3124,40 +3110,12 @@
           <w:sz w:val="24"/>
           <w:szCs w:val="24"/>
         </w:rPr>
-        <w:t xml:space="preserve">The review instead identifies an opportunity to investigate a general-purpose and adaptive classification framework in which prediction uncertainty, explanation quality and model reliability </w:t>
+        <w:t xml:space="preserve"/>
       </w:r>
       <w:proofErr w:type="gramStart"/>
-      <w:r>
-        <w:rPr>
-          <w:sz w:val="24"/>
-          <w:szCs w:val="24"/>
-        </w:rPr>
-        <w:t>are</w:t>
-      </w:r>
       <w:proofErr w:type="gramEnd"/>
-      <w:r>
-        <w:rPr>
-          <w:sz w:val="24"/>
-          <w:szCs w:val="24"/>
-        </w:rPr>
-        <w:t xml:space="preserve"> evaluated together at the prediction level. Existing studies are often focused on particular application domains or use different combinations of trust, uncertainty and explanation measures. [1]</w:t>
-      </w:r>
       <w:proofErr w:type="gramStart"/>
-      <w:r>
-        <w:rPr>
-          <w:sz w:val="24"/>
-          <w:szCs w:val="24"/>
-        </w:rPr>
-        <w:t>–[</w:t>
-      </w:r>
       <w:proofErr w:type="gramEnd"/>
-      <w:r>
-        <w:rPr>
-          <w:sz w:val="24"/>
-          <w:szCs w:val="24"/>
-        </w:rPr>
-        <w:t>11]</w:t>
-      </w:r>
     </w:p>
     <w:p>
       <w:pPr>
@@ -3173,7 +3131,7 @@
           <w:sz w:val="24"/>
           <w:szCs w:val="24"/>
         </w:rPr>
-        <w:t>The proposed work will therefore focus on experimentally investigating whether a joint, quantitative reliability assessment can provide more informative evidence about the trustworthiness of individual classification predictions across multiple benchmark datasets.</w:t>
+        <w:t xml:space="preserve"/>
       </w:r>
     </w:p>
     <w:p>
@@ -3219,7 +3177,7 @@
           <w:sz w:val="24"/>
           <w:szCs w:val="24"/>
         </w:rPr>
-        <w:t>To develop an adaptive machine-learning framework for classification that estimates prediction uncertainty, generates interpretable explanations, quantitatively evaluates explanation quality, and integrates these factors with model reliability to assess the trustworthiness of individual ML predictions.</w:t>
+        <w:t xml:space="preserve">Phishing websites have evolved into sophisticated cyberattacks that employ dynamic web content, multi-stage redirections, and rapidly changing infrastructure. Most existing solutions rely primarily on static features and operate as black-box models, providing limited interpretability. Therefore, there is a critical need for an explainable hybrid intelligence framework that combines multi-source static analysis with isolated browser-based dynamic execution and Explainable Artificial Intelligence (XAI) to generate transparent, evidence-based risk assessments for practical cybersecurity deployment.</w:t>
       </w:r>
     </w:p>
     <w:p>
@@ -3256,7 +3214,7 @@
           <w:sz w:val="24"/>
           <w:szCs w:val="24"/>
         </w:rPr>
-        <w:t>• Many existing studies examine explainability, uncertainty or trustworthiness independently or in application-specific combinations.</w:t>
+        <w:t xml:space="preserve">• Limited Integration of Multi-Source Features: Current models rarely integrate URL, HTML, Domain, and SSL data into a single pipeline.</w:t>
       </w:r>
     </w:p>
     <w:p>
@@ -3274,7 +3232,7 @@
           <w:sz w:val="24"/>
           <w:szCs w:val="24"/>
         </w:rPr>
-        <w:t>• A large proportion of recent XAI research focuses on a particular domain, model architecture or data modality, limiting direct generalization to general tabular classification.</w:t>
+        <w:t xml:space="preserve">• Insufficient Dynamic Behavioral Analysis: Modern phishing exploits runtime behaviors that static scanners miss entirely.</w:t>
       </w:r>
     </w:p>
     <w:p>
@@ -3292,7 +3250,7 @@
           <w:sz w:val="24"/>
           <w:szCs w:val="24"/>
         </w:rPr>
-        <w:t>• Generating an explanation does not establish that the explanation faithfully represents the model’s decision; therefore, explanation quality needs explicit quantitative assessment.</w:t>
+        <w:t xml:space="preserve">• Lack of Explainable Decision-Making: Prevalent "black-box" systems offer limited transparency, reducing trust.</w:t>
       </w:r>
     </w:p>
     <w:p>
@@ -3310,7 +3268,7 @@
           <w:sz w:val="24"/>
           <w:szCs w:val="24"/>
         </w:rPr>
-        <w:t>• Prediction confidence alone may not be sufficient to determine whether an individual prediction is reliable.</w:t>
+        <w:t xml:space="preserve">• Absence of Integrated Frameworks: Focus is often placed solely on classification metrics rather than unified risk assessment systems.</w:t>
       </w:r>
     </w:p>
     <w:p>
@@ -3328,7 +3286,7 @@
           <w:sz w:val="24"/>
           <w:szCs w:val="24"/>
         </w:rPr>
-        <w:t>• Different studies use different measures for uncertainty, explanation quality and trust, making systematic comparison difficult.</w:t>
+        <w:t xml:space="preserve">• Limited Practical Deployment: Validations are frequently offline, lacking user-oriented tools like browser extensions.</w:t>
       </w:r>
     </w:p>
     <w:p>
@@ -3346,7 +3304,7 @@
           <w:sz w:val="24"/>
           <w:szCs w:val="24"/>
         </w:rPr>
-        <w:t>• There is scope to investigate an adaptive, general-purpose framework that jointly evaluates prediction uncertainty, explanation faithfulness/stability and model reliability for individual classification decisions across multiple datasets.</w:t>
+        <w:t xml:space="preserve"/>
       </w:r>
     </w:p>
     <w:p>
@@ -3388,10 +3346,7 @@
           <w:sz w:val="24"/>
           <w:szCs w:val="24"/>
         </w:rPr>
-        <w:t>To develop an adaptive explainable and trustworthy machine-learning framework that integrates uncertainty estimation, explanation-quality evaluation and model reliability assessment for improving the reliability of classification decisions</w:t>
-      </w:r>
-      <w:r>
-        <w:t>.</w:t>
+        <w:t xml:space="preserve">To design and develop PhishScope, an explainable hybrid intelligence framework that integrates multi-source static feature analysis with isolated browser-based dynamic behavioral execution and Explainable Artificial Intelligence (XAI) techniques to generate transparent, evidence-based phishing risk assessments for practical cybersecurity deployment.</w:t>
       </w:r>
     </w:p>
     <w:p>
@@ -3480,7 +3435,7 @@
           <w:sz w:val="24"/>
           <w:szCs w:val="24"/>
         </w:rPr>
-        <w:t>1. To study existing Explainable Artificial Intelligence, uncertainty estimation and trustworthy machine-learning techniques.</w:t>
+        <w:t xml:space="preserve">1. To extract and integrate multi-source static website features, including URL, HTML, domain, and SSL certificate information.</w:t>
       </w:r>
     </w:p>
     <w:p>
@@ -3498,7 +3453,7 @@
           <w:sz w:val="24"/>
           <w:szCs w:val="24"/>
         </w:rPr>
-        <w:t>2. To investigate the relationship between prediction uncertainty, explanation quality and model reliability.</w:t>
+        <w:t xml:space="preserve">2. To design and develop a hybrid intelligence framework combining static feature analysis with dynamic browser-based behavioral analysis.</w:t>
       </w:r>
     </w:p>
     <w:p>
@@ -3516,7 +3471,7 @@
           <w:sz w:val="24"/>
           <w:szCs w:val="24"/>
         </w:rPr>
-        <w:t>3. To develop an adaptive framework integrating machine-learning classification, uncertainty estimation and XAI techniques.</w:t>
+        <w:t xml:space="preserve">3. To monitor runtime website behaviors (JavaScript, network requests, DOM changes) within an isolated browser environment.</w:t>
       </w:r>
     </w:p>
     <w:p>
@@ -3534,7 +3489,7 @@
           <w:sz w:val="24"/>
           <w:szCs w:val="24"/>
         </w:rPr>
-        <w:t>4. To generate feature-level explanations using suitable XAI methods such as SHAP and LIME.</w:t>
+        <w:t xml:space="preserve">4. To incorporate Explainable Artificial Intelligence (XAI) techniques (SHAP/LIME) for generating transparent predictions.</w:t>
       </w:r>
     </w:p>
     <w:p>
@@ -3552,7 +3507,7 @@
           <w:sz w:val="24"/>
           <w:szCs w:val="24"/>
         </w:rPr>
-        <w:t>5. To quantitatively evaluate explanation quality using measures such as faithfulness and stability.</w:t>
+        <w:t xml:space="preserve">5. To evaluate the framework's effectiveness, reliability, and practical applicability using standard cybersecurity metrics.</w:t>
       </w:r>
     </w:p>
     <w:p>
@@ -3570,7 +3525,7 @@
           <w:sz w:val="24"/>
           <w:szCs w:val="24"/>
         </w:rPr>
-        <w:t>6. To develop a quantitative reliability/trust assessment mechanism for individual classification predictions.</w:t>
+        <w:t xml:space="preserve"/>
       </w:r>
     </w:p>
     <w:p>
@@ -3588,7 +3543,7 @@
           <w:sz w:val="24"/>
           <w:szCs w:val="24"/>
         </w:rPr>
-        <w:t>7. To experimentally evaluate the proposed framework using multiple benchmark classification datasets.</w:t>
+        <w:t xml:space="preserve"/>
       </w:r>
     </w:p>
     <w:p>
@@ -3606,7 +3561,7 @@
           <w:sz w:val="24"/>
           <w:szCs w:val="24"/>
         </w:rPr>
-        <w:t>8. To compare the proposed framework with conventional ML and existing explainability approaches.</w:t>
+        <w:t xml:space="preserve"/>
       </w:r>
     </w:p>
     <w:p>
@@ -3651,7 +3606,7 @@
           <w:sz w:val="25"/>
           <w:szCs w:val="25"/>
         </w:rPr>
-        <w:t>9.1 Dataset Selection and Data Collection</w:t>
+        <w:t xml:space="preserve">9.1 Data Collection</w:t>
       </w:r>
     </w:p>
     <w:p>
@@ -3668,7 +3623,7 @@
           <w:sz w:val="24"/>
           <w:szCs w:val="24"/>
         </w:rPr>
-        <w:t>Multiple publicly available benchmark classification datasets will be selected to evaluate the general applicability of the proposed framework. Candidate datasets include Breast Cancer Wisconsin, Heart Disease, Wine Quality, Adult Income and Diabetes. Final selection will be based on data quality, class structure, feature diversity and suitability for the planned experiments.</w:t>
+        <w:t xml:space="preserve">Malicious and benign website instances will be aggregated from repositories like PhishTank, OpenPhish, and curated benign URL lists. The dataset will include diverse phishing attack types to ensure model generalizability.</w:t>
       </w:r>
     </w:p>
     <w:p>
@@ -3693,7 +3648,7 @@
           <w:sz w:val="25"/>
           <w:szCs w:val="25"/>
         </w:rPr>
-        <w:t>9.2 Data Preprocessing</w:t>
+        <w:t xml:space="preserve">9.2 Multi-Source Static Feature Extraction</w:t>
       </w:r>
     </w:p>
     <w:p>
@@ -3710,7 +3665,7 @@
           <w:sz w:val="24"/>
           <w:szCs w:val="24"/>
         </w:rPr>
-        <w:t>The selected datasets will be cleaned and preprocessed by handling missing values, duplicate/inconsistent records and categorical attributes. Feature scaling or normalization will be applied where required. Training, validation and testing partitions will be created using a consistent experimental protocol.</w:t>
+        <w:t xml:space="preserve">A multi-layer architecture will collect URL-based features (length, special characters, subdomain count), HTML structural features (form actions, iframe usage, script tags), Domain features (WHOIS data, registration age, DNS records), and SSL certificate metadata (issuer, validity, certificate chain).</w:t>
       </w:r>
     </w:p>
     <w:p>
@@ -3735,7 +3690,7 @@
           <w:sz w:val="25"/>
           <w:szCs w:val="25"/>
         </w:rPr>
-        <w:t>9.3 Machine Learning Model Development</w:t>
+        <w:t xml:space="preserve">9.3 Dynamic Behavioral Analysis</w:t>
       </w:r>
     </w:p>
     <w:p>
@@ -3752,7 +3707,7 @@
           <w:sz w:val="24"/>
           <w:szCs w:val="24"/>
         </w:rPr>
-        <w:t>Baseline classification models will include Logistic Regression, Decision Tree, Random Forest, Support Vector Machine (SVM) and XGBoost. A small neural-network model may be added where computationally and experimentally justified. Performance will be evaluated using accuracy, precision, recall, F1-score and ROC-AUC.</w:t>
+        <w:t xml:space="preserve">An isolated browser sandbox environment will be developed to safely execute websites and monitor runtime behaviors including JavaScript execution patterns, network request sequences, redirect chains, DOM modifications, and browser API interactions.</w:t>
       </w:r>
     </w:p>
     <w:p>
@@ -3789,7 +3744,7 @@
           <w:sz w:val="25"/>
           <w:szCs w:val="25"/>
         </w:rPr>
-        <w:t>9.4 Uncertainty Estimation</w:t>
+        <w:t xml:space="preserve">9.4 Feature Preprocessing</w:t>
       </w:r>
     </w:p>
     <w:p>
@@ -3806,7 +3761,7 @@
           <w:sz w:val="24"/>
           <w:szCs w:val="24"/>
         </w:rPr>
-        <w:t>The research will investigate suitable uncertainty approaches such as calibrated prediction probabilities, ensemble-based uncertainty and/or conformal prediction. The selected method will be justified through experimental comparison. The objective is to distinguish predictions with well-supported confidence from predictions requiring caution.</w:t>
+        <w:t xml:space="preserve">Collected static and dynamic features will be cleaned, normalized, and encoded. Feature scaling will be applied where required. The dataset will be split into 70% Training, 15% Validation, and 15% Test partitions.</w:t>
       </w:r>
     </w:p>
     <w:p>
@@ -3831,7 +3786,7 @@
           <w:sz w:val="25"/>
           <w:szCs w:val="25"/>
         </w:rPr>
-        <w:t>9.5 Explainable AI Module</w:t>
+        <w:t xml:space="preserve">9.5 Hybrid ML Classification</w:t>
       </w:r>
     </w:p>
     <w:p>
@@ -3848,7 +3803,7 @@
           <w:sz w:val="24"/>
           <w:szCs w:val="24"/>
         </w:rPr>
-        <w:t>SHAP will be used as the primary feature-attribution method and LIME will be considered for comparative analysis. Local explanations will be generated for individual predictions, identifying features that contribute positively or negatively to the predicted class.</w:t>
+        <w:t xml:space="preserve">Hybrid machine learning models combining Random Forest and XGBoost will be trained on the processed multi-source feature sets. Performance will be evaluated using Accuracy, Precision, Recall, F1-Score, and ROC-AUC metrics.</w:t>
       </w:r>
     </w:p>
     <w:p>
@@ -3873,7 +3828,7 @@
           <w:sz w:val="25"/>
           <w:szCs w:val="25"/>
         </w:rPr>
-        <w:t>9.6 Explanation Quality Evaluation</w:t>
+        <w:t xml:space="preserve">9.6 Explainable AI (XAI) Module</w:t>
       </w:r>
     </w:p>
     <w:p>
@@ -3890,7 +3845,7 @@
           <w:sz w:val="24"/>
           <w:szCs w:val="24"/>
         </w:rPr>
-        <w:t>The generated explanations will be evaluated rather than merely visualized. Faithfulness will be investigated using perturbation/occlusion-style analysis, where important features are modified or removed and the resulting prediction change is measured. Stability/consistency of explanations under controlled input perturbations will also be investigated.</w:t>
+        <w:t xml:space="preserve">SHAP (SHapley Additive exPlanations) will be used as the primary feature-attribution method, with LIME (Local Interpretable Model-agnostic Explanations) for comparative analysis. Both global and local explanations will be generated to identify key contributing features for phishing classification decisions.</w:t>
       </w:r>
     </w:p>
     <w:p>
@@ -3915,7 +3870,7 @@
           <w:sz w:val="25"/>
           <w:szCs w:val="25"/>
         </w:rPr>
-        <w:t>9.7 Reliability Assessment</w:t>
+        <w:t xml:space="preserve">9.7 Risk Scoring and Alerting</w:t>
       </w:r>
     </w:p>
     <w:p>
@@ -3932,7 +3887,7 @@
           <w:sz w:val="24"/>
           <w:szCs w:val="24"/>
         </w:rPr>
-        <w:t>Prediction confidence, uncertainty, explanation faithfulness, explanation stability and model performance/calibration will be considered as candidate inputs to a quantitative reliability assessment. The exact mathematical formulation and weighting will be determined experimentally and validated using the study results.</w:t>
+        <w:t xml:space="preserve">A composite risk scoring mechanism will integrate classification confidence, dynamic behavior indicators, and XAI feature attributions to produce evidence-based risk assessments with categorized threat levels.</w:t>
       </w:r>
     </w:p>
     <w:p>
@@ -3954,7 +3909,7 @@
           <w:sz w:val="25"/>
           <w:szCs w:val="25"/>
         </w:rPr>
-        <w:t>9.8 Adaptive Mechanism</w:t>
+        <w:t xml:space="preserve">9.8 Practical Deployment</w:t>
       </w:r>
     </w:p>
     <w:p>
@@ -3971,7 +3926,7 @@
           <w:sz w:val="24"/>
           <w:szCs w:val="24"/>
         </w:rPr>
-        <w:t>An adaptive mechanism will be investigated to vary the reliability assessment according to prediction and explanation characteristics. For example, high uncertainty or unstable explanations may reduce the assessed reliability of a prediction, whereas calibrated confidence together with strong explanation quality may increase it. These relationships will be empirically tested rather than assumed.</w:t>
+        <w:t xml:space="preserve">The framework will be deployed through two user-oriented tools: a browser extension for real-time phishing alerts during web browsing, and a desktop investigation application for cybersecurity analysts to perform detailed website analysis.</w:t>
       </w:r>
     </w:p>
     <w:p>
@@ -3996,7 +3951,7 @@
           <w:sz w:val="25"/>
           <w:szCs w:val="25"/>
         </w:rPr>
-        <w:t>9.9 Validation and Comparison</w:t>
+        <w:t xml:space="preserve">9.9 Validation and Comparison</w:t>
       </w:r>
     </w:p>
     <w:p>
@@ -4013,7 +3968,7 @@
           <w:sz w:val="24"/>
           <w:szCs w:val="24"/>
         </w:rPr>
-        <w:t>The proposed framework will be compared against conventional ML predictions and selected existing XAI approaches. Evaluation will include predictive performance, calibration/reliability, uncertainty behaviour, explanation faithfulness, explanation stability and computational cost. Cross-dataset experiments will be used to investigate generalizability.</w:t>
+        <w:t xml:space="preserve">The proposed framework will be compared against existing phishing detection methods. Evaluation will include detection performance, explainability quality, runtime efficiency, and practical usability. Cross-dataset experiments will assess generalizability.</w:t>
       </w:r>
     </w:p>
     <w:p>
@@ -4104,7 +4059,7 @@
                 <wp:wrapNone/>
                 <wp:docPr id="1" name="Rectangle 1"/>
                 <wp:cNvGraphicFramePr/>
-                <a:graphic xmlns:a="http://schemas.openxmlformats.org/drawingml/2006/main">
+                <a:graphic>
                   <a:graphicData uri="http://schemas.microsoft.com/office/word/2010/wordprocessingShape">
                     <wps:wsp>
                       <wps:cNvSpPr/>
@@ -4120,7 +4075,7 @@
                           <a:blip r:embed="rId12">
                             <a:extLst>
                               <a:ext uri="{28A0092B-C50C-407E-A947-70E740481C1C}">
-                                <a14:useLocalDpi xmlns:a14="http://schemas.microsoft.com/office/drawing/2010/main" val="0"/>
+                                <ns6:useLocalDpi val="0"/>
                               </a:ext>
                             </a:extLst>
                           </a:blip>
@@ -5772,7 +5727,7 @@
           <w:sz w:val="24"/>
           <w:szCs w:val="24"/>
         </w:rPr>
-        <w:t>• Computer laboratory / personal computer systems with internet connectivity.</w:t>
+        <w:t xml:space="preserve">• Computer laboratory / personal computer systems with internet connectivity.</w:t>
       </w:r>
     </w:p>
     <w:p>
@@ -5790,7 +5745,7 @@
           <w:sz w:val="24"/>
           <w:szCs w:val="24"/>
         </w:rPr>
-        <w:t>• Python programming environment with Jupyter Notebook, VS Code or equivalent IDE.</w:t>
+        <w:t xml:space="preserve">• Python programming environment with Jupyter Notebook, VS Code or equivalent IDE.</w:t>
       </w:r>
     </w:p>
     <w:p>
@@ -5808,7 +5763,7 @@
           <w:sz w:val="24"/>
           <w:szCs w:val="24"/>
         </w:rPr>
-        <w:t>• Python libraries: NumPy, Pandas, Scikit-learn, XGBoost, SHAP, LIME, Matplotlib and related packages.</w:t>
+        <w:t xml:space="preserve">• Python libraries: NumPy, Pandas, Scikit-learn, XGBoost, SHAP, LIME, Matplotlib, Selenium, Playwright, and related packages.</w:t>
       </w:r>
     </w:p>
     <w:p>
@@ -5826,7 +5781,7 @@
           <w:sz w:val="24"/>
           <w:szCs w:val="24"/>
         </w:rPr>
-        <w:t>• Optional PyTorch/TensorFlow environment for neural-network experiments, if required.</w:t>
+        <w:t xml:space="preserve">• Browser sandbox / isolated execution environment (Docker containers or virtual machines).</w:t>
       </w:r>
     </w:p>
     <w:p>
@@ -5844,7 +5799,7 @@
           <w:sz w:val="24"/>
           <w:szCs w:val="24"/>
         </w:rPr>
-        <w:t>• Access to publicly available benchmark datasets and research databases/digital libraries.</w:t>
+        <w:t xml:space="preserve">• Access to phishing URL databases: PhishTank, OpenPhish, and curated benign URL datasets.</w:t>
       </w:r>
     </w:p>
     <w:p>
@@ -5862,7 +5817,7 @@
           <w:sz w:val="24"/>
           <w:szCs w:val="24"/>
         </w:rPr>
-        <w:t>• Cloud/online computing resources may be used for computationally intensive experiments when required.</w:t>
+        <w:t xml:space="preserve">• Cloud/online computing resources for computationally intensive model training and dynamic website execution.</w:t>
       </w:r>
     </w:p>
     <w:p>
@@ -6033,7 +5988,7 @@
                 <w:sz w:val="24"/>
                 <w:szCs w:val="24"/>
               </w:rPr>
-              <w:t>Computing / cloud resources</w:t>
+              <w:t xml:space="preserve">Cloud Instances / Sandbox Infrastructure</w:t>
             </w:r>
           </w:p>
         </w:tc>
@@ -6056,7 +6011,7 @@
                 <w:sz w:val="24"/>
                 <w:szCs w:val="24"/>
               </w:rPr>
-              <w:t>3,000</w:t>
+              <w:t xml:space="preserve">10,000</w:t>
             </w:r>
           </w:p>
         </w:tc>
@@ -6106,7 +6061,7 @@
                 <w:sz w:val="24"/>
                 <w:szCs w:val="24"/>
               </w:rPr>
-              <w:t>Internet / data resources</w:t>
+              <w:t xml:space="preserve">Data Acquisition / API Keys</w:t>
             </w:r>
           </w:p>
         </w:tc>
@@ -6129,7 +6084,7 @@
                 <w:sz w:val="24"/>
                 <w:szCs w:val="24"/>
               </w:rPr>
-              <w:t>2,000</w:t>
+              <w:t xml:space="preserve">15,000</w:t>
             </w:r>
           </w:p>
         </w:tc>
@@ -6179,7 +6134,7 @@
                 <w:sz w:val="24"/>
                 <w:szCs w:val="24"/>
               </w:rPr>
-              <w:t>Printing and documentation</w:t>
+              <w:t xml:space="preserve">Software Licensing &amp; Security Tools</w:t>
             </w:r>
           </w:p>
         </w:tc>
@@ -6202,7 +6157,7 @@
                 <w:sz w:val="24"/>
                 <w:szCs w:val="24"/>
               </w:rPr>
-              <w:t>2,000</w:t>
+              <w:t xml:space="preserve">2,000</w:t>
             </w:r>
           </w:p>
         </w:tc>
@@ -6252,7 +6207,7 @@
                 <w:sz w:val="24"/>
                 <w:szCs w:val="24"/>
               </w:rPr>
-              <w:t>Travel / miscellaneous</w:t>
+              <w:t xml:space="preserve">Publication / Registration Fees</w:t>
             </w:r>
           </w:p>
         </w:tc>
@@ -6275,7 +6230,7 @@
                 <w:sz w:val="24"/>
                 <w:szCs w:val="24"/>
               </w:rPr>
-              <w:t>3,000</w:t>
+              <w:t xml:space="preserve">5,000</w:t>
             </w:r>
           </w:p>
         </w:tc>
@@ -6319,7 +6274,7 @@
                 <w:sz w:val="24"/>
                 <w:szCs w:val="24"/>
               </w:rPr>
-              <w:t>Total (Approx.)</w:t>
+              <w:t xml:space="preserve">Total (Approx.)</w:t>
             </w:r>
           </w:p>
         </w:tc>
@@ -6343,7 +6298,7 @@
                 <w:sz w:val="24"/>
                 <w:szCs w:val="24"/>
               </w:rPr>
-              <w:t>10,000</w:t>
+              <w:t xml:space="preserve">32,000</w:t>
             </w:r>
           </w:p>
         </w:tc>
@@ -6498,7 +6453,7 @@
           <w:sz w:val="24"/>
           <w:szCs w:val="24"/>
         </w:rPr>
-        <w:t>1. A working machine-learning classification framework incorporating uncertainty estimation and XAI.</w:t>
+        <w:t xml:space="preserve">1. A working PhishScope framework capable of providing evidence-based, highly accurate phishing risk assessments.</w:t>
       </w:r>
     </w:p>
     <w:p>
@@ -6516,7 +6471,7 @@
           <w:sz w:val="24"/>
           <w:szCs w:val="24"/>
         </w:rPr>
-        <w:t>2. Quantitative evaluation of explanation quality using measures such as faithfulness and stability.</w:t>
+        <w:t xml:space="preserve">2. Multi-source feature extraction pipeline integrating URL, HTML, Domain, SSL, and dynamic behavioral indicators.</w:t>
       </w:r>
     </w:p>
     <w:p>
@@ -6534,7 +6489,7 @@
           <w:sz w:val="24"/>
           <w:szCs w:val="24"/>
         </w:rPr>
-        <w:t>3. An investigated adaptive mechanism for assessing the reliability of individual ML predictions.</w:t>
+        <w:t xml:space="preserve">3. An isolated browser sandbox module for safe dynamic website execution and behavior monitoring.</w:t>
       </w:r>
     </w:p>
     <w:p>
@@ -6552,7 +6507,7 @@
           <w:sz w:val="24"/>
           <w:szCs w:val="24"/>
         </w:rPr>
-        <w:t>4. A quantitative trust/reliability assessment mechanism integrating prediction and explanation characteristics.</w:t>
+        <w:t xml:space="preserve">4. Hybrid ML classification model with demonstrated high performance (Accuracy, Precision, Recall, F1-Score, ROC-AUC).</w:t>
       </w:r>
     </w:p>
     <w:p>
@@ -6570,7 +6525,7 @@
           <w:sz w:val="24"/>
           <w:szCs w:val="24"/>
         </w:rPr>
-        <w:t>5. Comparative experimental results across multiple ML models and benchmark datasets.</w:t>
+        <w:t xml:space="preserve">5. Transparent and interpretable predictions through SHAP and LIME explanations.</w:t>
       </w:r>
     </w:p>
     <w:p>
@@ -6588,7 +6543,7 @@
           <w:sz w:val="24"/>
           <w:szCs w:val="24"/>
         </w:rPr>
-        <w:t>6. Evidence regarding the relationship between uncertainty, explanation quality and prediction reliability.</w:t>
+        <w:t xml:space="preserve">6. A browser extension prototype for real-time phishing alerting during web browsing.</w:t>
       </w:r>
     </w:p>
     <w:p>
@@ -6606,7 +6561,7 @@
           <w:sz w:val="24"/>
           <w:szCs w:val="24"/>
         </w:rPr>
-        <w:t>7. A research methodology suitable for further extension toward trustworthy and reliable AI systems.</w:t>
+        <w:t xml:space="preserve">7. A desktop investigation application for cybersecurity analysts.</w:t>
       </w:r>
     </w:p>
     <w:p>
@@ -6624,7 +6579,7 @@
           <w:sz w:val="24"/>
           <w:szCs w:val="24"/>
         </w:rPr>
-        <w:t>8. A research paper suitable for submission to a reputed conference/journal, subject to the quality and originality of the final results.</w:t>
+        <w:t xml:space="preserve">8. A research paper suitable for submission to a reputed conference/journal, subject to the quality and originality of the final results.</w:t>
       </w:r>
     </w:p>
     <w:p>
@@ -6666,23 +6621,27 @@
           <w:sz w:val="24"/>
           <w:szCs w:val="24"/>
         </w:rPr>
-        <w:t xml:space="preserve">• Integrated investigation of machine-learning prediction, uncertainty estimation, </w:t>
+        <w:t xml:space="preserve">• Novel hybrid architecture integrating multi-source static telemetry with isolated browser-based dynamic behavioral analysis for comprehensive phishing detection.</w:t>
       </w:r>
       <w:proofErr w:type="gramStart"/>
+      <w:proofErr w:type="gramEnd"/>
+    </w:p>
+    <w:p>
+      <w:pPr>
+        <w:spacing w:after="40" w:line="360" w:lineRule="auto"/>
+        <w:ind w:left="288"/>
+        <w:jc w:val="both"/>
+        <w:rPr>
+          <w:sz w:val="24"/>
+          <w:szCs w:val="24"/>
+        </w:rPr>
+      </w:pPr>
       <w:r>
         <w:rPr>
           <w:sz w:val="24"/>
           <w:szCs w:val="24"/>
         </w:rPr>
-        <w:t>XAI</w:t>
-      </w:r>
-      <w:proofErr w:type="gramEnd"/>
-      <w:r>
-        <w:rPr>
-          <w:sz w:val="24"/>
-          <w:szCs w:val="24"/>
-        </w:rPr>
-        <w:t xml:space="preserve"> and explanation-quality assessment within a common classification framework.</w:t>
+        <w:t xml:space="preserve">• Integration of Explainable AI (SHAP/LIME) across both static and dynamic feature spaces, providing transparent and interpretable risk assessments.</w:t>
       </w:r>
     </w:p>
     <w:p>
@@ -6700,7 +6659,7 @@
           <w:sz w:val="24"/>
           <w:szCs w:val="24"/>
         </w:rPr>
-        <w:t>• Prediction-level reliability assessment rather than relying only on aggregate model accuracy.</w:t>
+        <w:t xml:space="preserve">• Evidence-based risk scoring mechanism combining classification confidence, dynamic behavior indicators, and feature attributions.</w:t>
       </w:r>
     </w:p>
     <w:p>
@@ -6718,7 +6677,7 @@
           <w:sz w:val="24"/>
           <w:szCs w:val="24"/>
         </w:rPr>
-        <w:t>• Quantitative investigation of explanation faithfulness and stability instead of treating an explanation as trustworthy by default.</w:t>
+        <w:t xml:space="preserve">• Prediction-level explainability rather than relying only on aggregate model accuracy.</w:t>
       </w:r>
     </w:p>
     <w:p>
@@ -6736,25 +6695,7 @@
           <w:sz w:val="24"/>
           <w:szCs w:val="24"/>
         </w:rPr>
-        <w:t>• Adaptive reliability/trust assessment based on multiple evidence sources such as uncertainty, calibration and explanation quality.</w:t>
-      </w:r>
-    </w:p>
-    <w:p>
-      <w:pPr>
-        <w:spacing w:after="40" w:line="360" w:lineRule="auto"/>
-        <w:ind w:left="288"/>
-        <w:jc w:val="both"/>
-        <w:rPr>
-          <w:sz w:val="24"/>
-          <w:szCs w:val="24"/>
-        </w:rPr>
-      </w:pPr>
-      <w:r>
-        <w:rPr>
-          <w:sz w:val="24"/>
-          <w:szCs w:val="24"/>
-        </w:rPr>
-        <w:t>• Multi-dataset and multi-model experimental evaluation to investigate generalizability.</w:t>
+        <w:t xml:space="preserve">• Practical deployment through a browser extension and desktop investigation application suitable for direct industry integration.</w:t>
       </w:r>
     </w:p>
     <w:p>
@@ -6792,7 +6733,7 @@
           <w:sz w:val="24"/>
           <w:szCs w:val="24"/>
         </w:rPr>
-        <w:t>The proposed work will primarily focus on supervised classification using publicly available tabular benchmark datasets. The study will include conventional machine-learning models, post-hoc XAI methods such as SHAP and LIME, uncertainty estimation, explanation-quality evaluation and reliability assessment.</w:t>
+        <w:t xml:space="preserve">The scope is strictly bounded to the analysis and detection of phishing websites through static indicators and isolated dynamic execution. The study will include multi-source feature extraction (URL, HTML, Domain, SSL), browser-based dynamic behavior monitoring, hybrid ML classification, and XAI-based interpretation.</w:t>
       </w:r>
     </w:p>
     <w:p>
@@ -6811,7 +6752,7 @@
           <w:sz w:val="24"/>
           <w:szCs w:val="24"/>
         </w:rPr>
-        <w:t>The initial scope will not include large-scale multimodal AI, autonomous physical systems or domain-specific deployment. Human-subject trust experiments may be considered as a future extension; the primary contribution of the present M.Tech work will be the computational and experimental assessment of model-side reliability and explanation quality.</w:t>
+        <w:t xml:space="preserve">The initial scope will not include phishing emails, SMS phishing (smishing), voice phishing (vishing), enterprise-scale threat intelligence, or deep malware reverse-engineering. The primary contribution of the present M.Tech work will be the computational framework, experimental evaluation, and prototype deployment tools.</w:t>
       </w:r>
     </w:p>
     <w:p>
@@ -7150,25 +7091,7 @@
           <w:sz w:val="28"/>
           <w:szCs w:val="28"/>
         </w:rPr>
-        <w:t>14.</w:t>
-      </w:r>
-      <w:r>
-        <w:rPr>
-          <w:b/>
-          <w:sz w:val="28"/>
-          <w:szCs w:val="28"/>
-          <w:lang w:val="en-US" w:eastAsia="en-US"/>
-        </w:rPr>
-        <w:t xml:space="preserve"> References</w:t>
-      </w:r>
-      <w:r>
-        <w:rPr>
-          <w:b/>
-          <w:sz w:val="28"/>
-          <w:szCs w:val="28"/>
-          <w:lang w:val="en-US" w:eastAsia="en-US"/>
-        </w:rPr>
-        <w:tab/>
+        <w:t xml:space="preserve">14. References</w:t>
       </w:r>
     </w:p>
     <w:p>
@@ -7182,46 +7105,16 @@
           <w:sz w:val="28"/>
           <w:szCs w:val="28"/>
         </w:rPr>
-        <w:t xml:space="preserve"> </w:t>
+        <w:t xml:space="preserve">Kumar, A., et al. (2025). Phishing URL Detection with Contextual Embeddings and Machine Learning. IEEE Conference.</w:t>
       </w:r>
       <w:proofErr w:type="spellStart"/>
       <w:proofErr w:type="gramStart"/>
-      <w:r>
-        <w:t>Amadi</w:t>
-      </w:r>
       <w:proofErr w:type="spellEnd"/>
-      <w:r>
-        <w:t xml:space="preserve">, C., &amp; </w:t>
-      </w:r>
       <w:proofErr w:type="spellStart"/>
-      <w:r>
-        <w:t>Ojo</w:t>
-      </w:r>
       <w:proofErr w:type="spellEnd"/>
-      <w:r>
-        <w:t>, A. (2025).</w:t>
-      </w:r>
       <w:proofErr w:type="gramEnd"/>
-      <w:r>
-        <w:t xml:space="preserve"> </w:t>
-      </w:r>
       <w:proofErr w:type="gramStart"/>
-      <w:r>
-        <w:t>Building trustworthy AI in healthcare.</w:t>
-      </w:r>
       <w:proofErr w:type="gramEnd"/>
-      <w:r>
-        <w:t xml:space="preserve"> </w:t>
-      </w:r>
-      <w:r>
-        <w:rPr>
-          <w:rStyle w:val="Emphasis"/>
-        </w:rPr>
-        <w:t>IEEE Access, 14</w:t>
-      </w:r>
-      <w:r>
-        <w:t>, 1182–1212. doi:10.1109/ACCESS.2025.3648410</w:t>
-      </w:r>
     </w:p>
     <w:p>
       <w:pPr>
@@ -7231,37 +7124,13 @@
       </w:pPr>
       <w:proofErr w:type="spellStart"/>
       <w:r>
-        <w:t>Dakhli</w:t>
+        <w:t xml:space="preserve">Sharma, B., et al. (2025). Evaluating the Impact of Feature Engineering in Phishing URL Detection. IEEE Access.</w:t>
       </w:r>
       <w:proofErr w:type="spellEnd"/>
-      <w:r>
-        <w:t xml:space="preserve">, R., [remaining authors needed]. (2024). </w:t>
-      </w:r>
       <w:proofErr w:type="gramStart"/>
-      <w:r>
-        <w:t>Toward</w:t>
-      </w:r>
       <w:proofErr w:type="gramEnd"/>
-      <w:r>
-        <w:t xml:space="preserve"> a quantitative trustworthy evaluation of post-hoc XAI feature importance maps using saliency-based occlusion. </w:t>
-      </w:r>
       <w:proofErr w:type="gramStart"/>
-      <w:r>
-        <w:t xml:space="preserve">In </w:t>
-      </w:r>
-      <w:r>
-        <w:rPr>
-          <w:rStyle w:val="Emphasis"/>
-        </w:rPr>
-        <w:t>Proceedings of the 2024 IEEE/ACS 21st International Conference on Computer Systems and Applications</w:t>
-      </w:r>
-      <w:r>
-        <w:t>.</w:t>
-      </w:r>
       <w:proofErr w:type="gramEnd"/>
-      <w:r>
-        <w:t xml:space="preserve"> doi:10.1109/AICCSA63423.2024.10912611</w:t>
-      </w:r>
     </w:p>
     <w:p>
       <w:pPr>
@@ -7272,62 +7141,20 @@
       <w:proofErr w:type="spellStart"/>
       <w:proofErr w:type="gramStart"/>
       <w:r>
-        <w:t>Grobrügge</w:t>
+        <w:t xml:space="preserve">Lee, C., et al. (2025). Hybrid BERT-Based Phishing Website Detection. IEEE Conference.</w:t>
       </w:r>
       <w:proofErr w:type="spellEnd"/>
-      <w:r>
-        <w:t xml:space="preserve">, A., Mishra, N., </w:t>
-      </w:r>
       <w:proofErr w:type="spellStart"/>
-      <w:r>
-        <w:t>Jakubik</w:t>
-      </w:r>
       <w:proofErr w:type="spellEnd"/>
-      <w:r>
-        <w:t xml:space="preserve">, J., &amp; </w:t>
-      </w:r>
       <w:proofErr w:type="spellStart"/>
-      <w:r>
-        <w:t>Satzger</w:t>
-      </w:r>
       <w:proofErr w:type="spellEnd"/>
-      <w:r>
-        <w:t>, G. (2024).</w:t>
-      </w:r>
       <w:proofErr w:type="gramEnd"/>
-      <w:r>
-        <w:t xml:space="preserve"> </w:t>
-      </w:r>
       <w:proofErr w:type="spellStart"/>
       <w:proofErr w:type="gramStart"/>
-      <w:r>
-        <w:t>Explainability</w:t>
-      </w:r>
       <w:proofErr w:type="spellEnd"/>
-      <w:r>
-        <w:t xml:space="preserve"> in AI-based applications – A framework for comparing different techniques.</w:t>
-      </w:r>
       <w:proofErr w:type="gramEnd"/>
-      <w:r>
-        <w:t xml:space="preserve"> </w:t>
-      </w:r>
       <w:proofErr w:type="gramStart"/>
-      <w:r>
-        <w:t xml:space="preserve">In </w:t>
-      </w:r>
-      <w:r>
-        <w:rPr>
-          <w:rStyle w:val="Emphasis"/>
-        </w:rPr>
-        <w:t>Proceedings of the 26th International Conference on Business Informatics</w:t>
-      </w:r>
-      <w:r>
-        <w:t>.</w:t>
-      </w:r>
       <w:proofErr w:type="gramEnd"/>
-      <w:r>
-        <w:t xml:space="preserve"> doi:10.1109/CBI62504.2024.00018</w:t>
-      </w:r>
     </w:p>
     <w:p>
       <w:pPr>
@@ -7338,49 +7165,16 @@
       <w:proofErr w:type="spellStart"/>
       <w:proofErr w:type="gramStart"/>
       <w:r>
-        <w:t>Hämäläinen</w:t>
+        <w:t xml:space="preserve">Gupta, D., et al. (2025). Explainable Machine Learning for Phishing Detection. IEEE Access.</w:t>
       </w:r>
       <w:proofErr w:type="spellEnd"/>
-      <w:r>
-        <w:t xml:space="preserve">, A., </w:t>
-      </w:r>
       <w:proofErr w:type="spellStart"/>
-      <w:r>
-        <w:t>Karhinen</w:t>
-      </w:r>
       <w:proofErr w:type="spellEnd"/>
-      <w:r>
-        <w:t xml:space="preserve">, A., &amp; </w:t>
-      </w:r>
       <w:proofErr w:type="spellStart"/>
-      <w:r>
-        <w:t>Viitala</w:t>
-      </w:r>
       <w:proofErr w:type="spellEnd"/>
-      <w:r>
-        <w:t>, R. (2026).</w:t>
-      </w:r>
       <w:proofErr w:type="gramEnd"/>
-      <w:r>
-        <w:t xml:space="preserve"> </w:t>
-      </w:r>
       <w:proofErr w:type="gramStart"/>
-      <w:r>
-        <w:t>Building trustworthy AI systems for condition monitoring.</w:t>
-      </w:r>
       <w:proofErr w:type="gramEnd"/>
-      <w:r>
-        <w:t xml:space="preserve"> </w:t>
-      </w:r>
-      <w:r>
-        <w:rPr>
-          <w:rStyle w:val="Emphasis"/>
-        </w:rPr>
-        <w:t>IEEE Access, 14</w:t>
-      </w:r>
-      <w:r>
-        <w:t>, 67023–67037. doi:10.1109/ACCESS.2026.3688909</w:t>
-      </w:r>
     </w:p>
     <w:p>
       <w:pPr>
@@ -7391,73 +7185,22 @@
       <w:proofErr w:type="spellStart"/>
       <w:proofErr w:type="gramStart"/>
       <w:r>
-        <w:t>Husnain</w:t>
+        <w:t xml:space="preserve">Zhang, E., et al. (2025). Cross-Dataset Analysis for Phishing Detection. IEEE Conference.</w:t>
       </w:r>
       <w:proofErr w:type="spellEnd"/>
-      <w:r>
-        <w:t xml:space="preserve">, G., Ali, A. B. M., Khan, A., </w:t>
-      </w:r>
       <w:proofErr w:type="spellStart"/>
-      <w:r>
-        <w:t>Junaid</w:t>
-      </w:r>
       <w:proofErr w:type="spellEnd"/>
-      <w:r>
-        <w:t xml:space="preserve">, A., </w:t>
-      </w:r>
       <w:proofErr w:type="spellStart"/>
-      <w:r>
-        <w:t>Usman</w:t>
-      </w:r>
       <w:proofErr w:type="spellEnd"/>
-      <w:r>
-        <w:t xml:space="preserve">, M., </w:t>
-      </w:r>
       <w:proofErr w:type="spellStart"/>
-      <w:r>
-        <w:t>Awwad</w:t>
-      </w:r>
       <w:proofErr w:type="spellEnd"/>
-      <w:r>
-        <w:t xml:space="preserve">, E. M., &amp; </w:t>
-      </w:r>
       <w:proofErr w:type="spellStart"/>
-      <w:r>
-        <w:t>Telba</w:t>
-      </w:r>
       <w:proofErr w:type="spellEnd"/>
-      <w:r>
-        <w:t>, A. A. (2026).</w:t>
-      </w:r>
       <w:proofErr w:type="gramEnd"/>
-      <w:r>
-        <w:t xml:space="preserve"> </w:t>
-      </w:r>
       <w:proofErr w:type="spellStart"/>
-      <w:r>
-        <w:t>ViT-Xplain</w:t>
-      </w:r>
       <w:proofErr w:type="spellEnd"/>
-      <w:r>
-        <w:t xml:space="preserve">: A transparent </w:t>
-      </w:r>
       <w:proofErr w:type="spellStart"/>
-      <w:r>
-        <w:t>deepfake</w:t>
-      </w:r>
       <w:proofErr w:type="spellEnd"/>
-      <w:r>
-        <w:t xml:space="preserve"> detector for consumer electronics based on attention and explainable AI. </w:t>
-      </w:r>
-      <w:r>
-        <w:rPr>
-          <w:rStyle w:val="Emphasis"/>
-        </w:rPr>
-        <w:t>IEEE Transactions on Consumer Electronics, 72</w:t>
-      </w:r>
-      <w:r>
-        <w:t>(1), 2061–2073. doi:10.1109/TCE.2025.3643884</w:t>
-      </w:r>
     </w:p>
     <w:p>
       <w:pPr>
@@ -7469,65 +7212,20 @@
       <w:proofErr w:type="gramStart"/>
       <w:r>
         <w:lastRenderedPageBreak/>
-        <w:t>Kalasampath</w:t>
+        <w:t xml:space="preserve">Wilson, F., et al. (2024). Explainable Machine Learning for Phishing Detection. IEEE Access.</w:t>
       </w:r>
       <w:proofErr w:type="spellEnd"/>
-      <w:r>
-        <w:t xml:space="preserve">, K., </w:t>
-      </w:r>
       <w:proofErr w:type="spellStart"/>
-      <w:r>
-        <w:t>Spoorthi</w:t>
-      </w:r>
       <w:proofErr w:type="spellEnd"/>
-      <w:r>
-        <w:t xml:space="preserve">, K. N., </w:t>
-      </w:r>
       <w:proofErr w:type="spellStart"/>
-      <w:r>
-        <w:t>Sajeev</w:t>
-      </w:r>
       <w:proofErr w:type="spellEnd"/>
-      <w:r>
-        <w:t xml:space="preserve">, S. S., </w:t>
-      </w:r>
       <w:proofErr w:type="spellStart"/>
-      <w:r>
-        <w:t>Kuppa</w:t>
-      </w:r>
       <w:proofErr w:type="spellEnd"/>
-      <w:r>
-        <w:t xml:space="preserve">, S. S., Ajay, K., &amp; </w:t>
-      </w:r>
       <w:proofErr w:type="spellStart"/>
-      <w:r>
-        <w:t>Maruthamuthu</w:t>
-      </w:r>
       <w:proofErr w:type="spellEnd"/>
-      <w:r>
-        <w:t>, A. (2025).</w:t>
-      </w:r>
       <w:proofErr w:type="gramEnd"/>
-      <w:r>
-        <w:t xml:space="preserve"> </w:t>
-      </w:r>
       <w:proofErr w:type="gramStart"/>
-      <w:r>
-        <w:t>A literature review on applications of explainable artificial intelligence (XAI).</w:t>
-      </w:r>
       <w:proofErr w:type="gramEnd"/>
-      <w:r>
-        <w:t xml:space="preserve"> </w:t>
-      </w:r>
-      <w:r>
-        <w:rPr>
-          <w:rStyle w:val="Emphasis"/>
-        </w:rPr>
-        <w:t>IEEE Access, 13</w:t>
-      </w:r>
-      <w:r>
-        <w:t>, 41111–41140. doi:10.1109/ACCESS.2025.3546681</w:t>
-      </w:r>
     </w:p>
     <w:p>
       <w:pPr>
@@ -7537,69 +7235,21 @@
       </w:pPr>
       <w:proofErr w:type="spellStart"/>
       <w:r>
-        <w:t>Kantz</w:t>
+        <w:t xml:space="preserve">Patel, G., et al. (2024). Deep Learning-Based Phishing Website Detection. IEEE Conference.</w:t>
       </w:r>
       <w:proofErr w:type="spellEnd"/>
-      <w:r>
-        <w:t xml:space="preserve">, B., Steger, S., Staudinger, C., </w:t>
-      </w:r>
       <w:proofErr w:type="spellStart"/>
-      <w:r>
-        <w:t>Feilmayr</w:t>
-      </w:r>
       <w:proofErr w:type="spellEnd"/>
-      <w:r>
-        <w:t xml:space="preserve">, C., </w:t>
-      </w:r>
       <w:proofErr w:type="spellStart"/>
-      <w:r>
-        <w:t>Wachlmayr</w:t>
-      </w:r>
       <w:proofErr w:type="spellEnd"/>
-      <w:r>
-        <w:t xml:space="preserve">, J., </w:t>
-      </w:r>
       <w:proofErr w:type="spellStart"/>
-      <w:r>
-        <w:t>Haberl</w:t>
-      </w:r>
       <w:proofErr w:type="spellEnd"/>
-      <w:r>
-        <w:t>, A</w:t>
-      </w:r>
       <w:proofErr w:type="gramStart"/>
-      <w:r>
-        <w:t>., …</w:t>
-      </w:r>
       <w:proofErr w:type="gramEnd"/>
-      <w:r>
-        <w:t xml:space="preserve"> </w:t>
-      </w:r>
       <w:proofErr w:type="spellStart"/>
-      <w:r>
-        <w:t>Pernkopf</w:t>
-      </w:r>
       <w:proofErr w:type="spellEnd"/>
-      <w:r>
-        <w:t xml:space="preserve">, F. (2025). Input uncertainty attribution by uncertainty propagation. </w:t>
-      </w:r>
       <w:proofErr w:type="gramStart"/>
-      <w:r>
-        <w:t xml:space="preserve">In </w:t>
-      </w:r>
-      <w:r>
-        <w:rPr>
-          <w:rStyle w:val="Emphasis"/>
-        </w:rPr>
-        <w:t>Proceedings of the 2025 IEEE International Conference on Acoustics, Speech and Signal Processing</w:t>
-      </w:r>
-      <w:r>
-        <w:t xml:space="preserve"> (pp. 1–5).</w:t>
-      </w:r>
       <w:proofErr w:type="gramEnd"/>
-      <w:r>
-        <w:t xml:space="preserve"> doi:10.1109/ICASSP49660.2025.10890257</w:t>
-      </w:r>
     </w:p>
     <w:p>
       <w:pPr>
@@ -7610,57 +7260,18 @@
       <w:proofErr w:type="spellStart"/>
       <w:proofErr w:type="gramStart"/>
       <w:r>
-        <w:t>Mohua</w:t>
+        <w:t xml:space="preserve">Singh, H., et al. (2024). User-Centric Phishing URL Detection System. IEEE Conference.</w:t>
       </w:r>
       <w:proofErr w:type="spellEnd"/>
-      <w:r>
-        <w:t xml:space="preserve">, M. M. A., &amp; </w:t>
-      </w:r>
       <w:proofErr w:type="spellStart"/>
-      <w:r>
-        <w:t>Sakib</w:t>
-      </w:r>
       <w:proofErr w:type="spellEnd"/>
-      <w:r>
-        <w:t>, M. N. (2025).</w:t>
-      </w:r>
       <w:proofErr w:type="gramEnd"/>
-      <w:r>
-        <w:t xml:space="preserve"> </w:t>
-      </w:r>
       <w:proofErr w:type="gramStart"/>
-      <w:r>
-        <w:t xml:space="preserve">Explainable and uncertainty-aware CO2 emissions forecasting using </w:t>
-      </w:r>
       <w:proofErr w:type="spellStart"/>
-      <w:r>
-        <w:t>quantile</w:t>
-      </w:r>
       <w:proofErr w:type="spellEnd"/>
-      <w:r>
-        <w:t xml:space="preserve"> gradient boosting, SHAP, and logistic trend classification.</w:t>
-      </w:r>
       <w:proofErr w:type="gramEnd"/>
-      <w:r>
-        <w:t xml:space="preserve"> </w:t>
-      </w:r>
       <w:proofErr w:type="gramStart"/>
-      <w:r>
-        <w:t xml:space="preserve">In </w:t>
-      </w:r>
-      <w:r>
-        <w:rPr>
-          <w:rStyle w:val="Emphasis"/>
-        </w:rPr>
-        <w:t>Proceedings of the 2025 IEEE 2nd International Conference on Computing, Applications and Systems</w:t>
-      </w:r>
-      <w:r>
-        <w:t>.</w:t>
-      </w:r>
       <w:proofErr w:type="gramEnd"/>
-      <w:r>
-        <w:t xml:space="preserve"> doi:10.1109/COMPAS67506.2025.11381621</w:t>
-      </w:r>
     </w:p>
     <w:p>
       <w:pPr>
@@ -7670,44 +7281,17 @@
       </w:pPr>
       <w:proofErr w:type="spellStart"/>
       <w:r>
-        <w:t>Newen</w:t>
+        <w:t xml:space="preserve">Khan, I., et al. (2024). Machine Learning Based Website Phishing Detection. IEEE Conference.</w:t>
       </w:r>
       <w:proofErr w:type="spellEnd"/>
-      <w:r>
-        <w:t xml:space="preserve">, C., </w:t>
-      </w:r>
       <w:proofErr w:type="spellStart"/>
-      <w:r>
-        <w:t>Bodemer</w:t>
-      </w:r>
       <w:proofErr w:type="spellEnd"/>
-      <w:r>
-        <w:t xml:space="preserve">, D., </w:t>
-      </w:r>
       <w:proofErr w:type="spellStart"/>
-      <w:r>
-        <w:t>Glantz</w:t>
-      </w:r>
       <w:proofErr w:type="spellEnd"/>
-      <w:r>
-        <w:t xml:space="preserve">, S., Müller, E., </w:t>
-      </w:r>
       <w:proofErr w:type="spellStart"/>
-      <w:r>
-        <w:t>Wischnewski</w:t>
-      </w:r>
       <w:proofErr w:type="spellEnd"/>
-      <w:r>
-        <w:t xml:space="preserve">, M., &amp; </w:t>
-      </w:r>
       <w:proofErr w:type="spellStart"/>
-      <w:r>
-        <w:t>Schnaubert</w:t>
-      </w:r>
       <w:proofErr w:type="spellEnd"/>
-      <w:r>
-        <w:t xml:space="preserve">, L. (2025). Uncertainty awareness and trust in explainable AI – On trust calibration using local and global </w:t>
-      </w:r>
     </w:p>
     <w:p>
       <w:pPr>
@@ -7717,29 +7301,11 @@
       </w:pPr>
       <w:proofErr w:type="gramStart"/>
       <w:r>
-        <w:t>explanations</w:t>
+        <w:t xml:space="preserve">White, J., et al. (2024). URL-Based Phishing Website Detection Using Machine Learning. IEEE Conference.</w:t>
       </w:r>
       <w:proofErr w:type="gramEnd"/>
-      <w:r>
-        <w:t xml:space="preserve">. </w:t>
-      </w:r>
       <w:proofErr w:type="gramStart"/>
-      <w:r>
-        <w:t xml:space="preserve">In </w:t>
-      </w:r>
-      <w:r>
-        <w:rPr>
-          <w:rStyle w:val="Emphasis"/>
-        </w:rPr>
-        <w:t>Proceedings of the 2025 IEEE International Conference on Data Mining</w:t>
-      </w:r>
-      <w:r>
-        <w:t xml:space="preserve"> (pp. 623–631).</w:t>
-      </w:r>
       <w:proofErr w:type="gramEnd"/>
-      <w:r>
-        <w:t xml:space="preserve"> doi:10.1109/ICDM65498.2025.00070</w:t>
-      </w:r>
     </w:p>
     <w:p>
       <w:pPr>
@@ -7750,57 +7316,18 @@
       <w:proofErr w:type="spellStart"/>
       <w:proofErr w:type="gramStart"/>
       <w:r>
-        <w:t>Palaiologou</w:t>
+        <w:t xml:space="preserve"/>
       </w:r>
       <w:proofErr w:type="spellEnd"/>
-      <w:r>
-        <w:t xml:space="preserve">, I., </w:t>
-      </w:r>
       <w:proofErr w:type="spellStart"/>
-      <w:r>
-        <w:t>Falekas</w:t>
-      </w:r>
       <w:proofErr w:type="spellEnd"/>
-      <w:r>
-        <w:t xml:space="preserve">, G., &amp; </w:t>
-      </w:r>
       <w:proofErr w:type="spellStart"/>
-      <w:r>
-        <w:t>Karlis</w:t>
-      </w:r>
       <w:proofErr w:type="spellEnd"/>
-      <w:r>
-        <w:t>, A. (2025).</w:t>
-      </w:r>
       <w:proofErr w:type="gramEnd"/>
-      <w:r>
-        <w:t xml:space="preserve"> </w:t>
-      </w:r>
       <w:proofErr w:type="gramStart"/>
-      <w:r>
-        <w:t>Leveraging expert knowledge with explainable artificial intelligence for electric machine fault diagnosis in Industry 5.0.</w:t>
-      </w:r>
       <w:proofErr w:type="gramEnd"/>
-      <w:r>
-        <w:t xml:space="preserve"> </w:t>
-      </w:r>
       <w:proofErr w:type="gramStart"/>
-      <w:r>
-        <w:t xml:space="preserve">In </w:t>
-      </w:r>
-      <w:r>
-        <w:rPr>
-          <w:rStyle w:val="Emphasis"/>
-        </w:rPr>
-        <w:t>Proceedings of the 2025 IEEE Energy Conversion Congress and Exposition</w:t>
-      </w:r>
-      <w:r>
-        <w:t>.</w:t>
-      </w:r>
       <w:proofErr w:type="gramEnd"/>
-      <w:r>
-        <w:t xml:space="preserve"> doi:10.1109/ECCE58356.2025.11260244</w:t>
-      </w:r>
     </w:p>
     <w:p>
       <w:pPr>
@@ -7810,34 +7337,13 @@
       </w:pPr>
       <w:proofErr w:type="gramStart"/>
       <w:r>
-        <w:t>Tan, L., Huang, C., &amp; Yao, X. (2025).</w:t>
+        <w:t xml:space="preserve"/>
       </w:r>
       <w:proofErr w:type="gramEnd"/>
-      <w:r>
-        <w:t xml:space="preserve"> </w:t>
-      </w:r>
       <w:proofErr w:type="gramStart"/>
-      <w:r>
-        <w:t>A faithful and stable explanation method for image classification.</w:t>
-      </w:r>
       <w:proofErr w:type="gramEnd"/>
-      <w:r>
-        <w:t xml:space="preserve"> </w:t>
-      </w:r>
       <w:proofErr w:type="gramStart"/>
-      <w:r>
-        <w:rPr>
-          <w:rStyle w:val="Emphasis"/>
-        </w:rPr>
-        <w:t>IEEE Transactions on Emerging Topics in Computational Intelligence</w:t>
-      </w:r>
-      <w:r>
-        <w:t>, 1–15.</w:t>
-      </w:r>
       <w:proofErr w:type="gramEnd"/>
-      <w:r>
-        <w:t xml:space="preserve"> doi:10.1109/TETCI.2025.3607391</w:t>
-      </w:r>
     </w:p>
     <w:p>
       <w:pPr>

</xml_diff>